<commit_message>
Change Minors Mistake from previous meeting minutes
</commit_message>
<xml_diff>
--- a/Meeting Minutes/Meeting Minutes.docx
+++ b/Meeting Minutes/Meeting Minutes.docx
@@ -122,6 +122,41 @@
           <w:tab w:val="right" w:pos="8931"/>
         </w:tabs>
         <w:spacing w:after="0" w:line="240" w:lineRule="auto"/>
+        <w:ind w:left="-284"/>
+        <w:rPr>
+          <w:rFonts w:ascii="Times New Roman" w:hAnsi="Times New Roman" w:cs="Times New Roman"/>
+          <w:sz w:val="28"/>
+          <w:szCs w:val="28"/>
+          <w:lang w:val="en-US"/>
+        </w:rPr>
+      </w:pPr>
+      <w:r>
+        <w:rPr>
+          <w:rFonts w:ascii="Times New Roman" w:hAnsi="Times New Roman" w:cs="Times New Roman"/>
+          <w:b/>
+          <w:bCs/>
+          <w:sz w:val="28"/>
+          <w:szCs w:val="28"/>
+          <w:lang w:val="en-US"/>
+        </w:rPr>
+        <w:t xml:space="preserve">Location: </w:t>
+      </w:r>
+      <w:r>
+        <w:rPr>
+          <w:rFonts w:ascii="Times New Roman" w:hAnsi="Times New Roman" w:cs="Times New Roman"/>
+          <w:sz w:val="28"/>
+          <w:szCs w:val="28"/>
+          <w:lang w:val="en-US"/>
+        </w:rPr>
+        <w:t>Online Meeting</w:t>
+      </w:r>
+    </w:p>
+    <w:p>
+      <w:pPr>
+        <w:tabs>
+          <w:tab w:val="right" w:pos="8931"/>
+        </w:tabs>
+        <w:spacing w:after="0" w:line="240" w:lineRule="auto"/>
         <w:rPr>
           <w:rFonts w:ascii="Times New Roman" w:hAnsi="Times New Roman" w:cs="Times New Roman"/>
           <w:b/>
@@ -326,6 +361,13 @@
               </w:rPr>
               <w:t>Discussio</w:t>
             </w:r>
+            <w:r>
+              <w:rPr>
+                <w:rFonts w:ascii="Times New Roman" w:hAnsi="Times New Roman" w:cs="Times New Roman"/>
+                <w:lang w:val="en-US"/>
+              </w:rPr>
+              <w:t>n</w:t>
+            </w:r>
           </w:p>
         </w:tc>
         <w:tc>
@@ -370,7 +412,23 @@
                 <w:rFonts w:ascii="Times New Roman" w:hAnsi="Times New Roman" w:cs="Times New Roman"/>
                 <w:lang w:val="en-US"/>
               </w:rPr>
-              <w:t xml:space="preserve">Xi Zixun </w:t>
+              <w:t xml:space="preserve">Xi </w:t>
+            </w:r>
+            <w:proofErr w:type="spellStart"/>
+            <w:r>
+              <w:rPr>
+                <w:rFonts w:ascii="Times New Roman" w:hAnsi="Times New Roman" w:cs="Times New Roman"/>
+                <w:lang w:val="en-US"/>
+              </w:rPr>
+              <w:t>Zixun</w:t>
+            </w:r>
+            <w:proofErr w:type="spellEnd"/>
+            <w:r>
+              <w:rPr>
+                <w:rFonts w:ascii="Times New Roman" w:hAnsi="Times New Roman" w:cs="Times New Roman"/>
+                <w:lang w:val="en-US"/>
+              </w:rPr>
+              <w:t xml:space="preserve"> </w:t>
             </w:r>
           </w:p>
           <w:p>
@@ -480,7 +538,23 @@
                 <w:rFonts w:ascii="Times New Roman" w:hAnsi="Times New Roman" w:cs="Times New Roman"/>
                 <w:lang w:val="en-US"/>
               </w:rPr>
-              <w:t>EDA, CDA – Xi Zixun (Sunday</w:t>
+              <w:t xml:space="preserve">EDA, CDA – Xi </w:t>
+            </w:r>
+            <w:proofErr w:type="spellStart"/>
+            <w:r>
+              <w:rPr>
+                <w:rFonts w:ascii="Times New Roman" w:hAnsi="Times New Roman" w:cs="Times New Roman"/>
+                <w:lang w:val="en-US"/>
+              </w:rPr>
+              <w:t>Zixun</w:t>
+            </w:r>
+            <w:proofErr w:type="spellEnd"/>
+            <w:r>
+              <w:rPr>
+                <w:rFonts w:ascii="Times New Roman" w:hAnsi="Times New Roman" w:cs="Times New Roman"/>
+                <w:lang w:val="en-US"/>
+              </w:rPr>
+              <w:t xml:space="preserve"> (Sunday</w:t>
             </w:r>
             <w:r>
               <w:rPr>
@@ -508,7 +582,23 @@
                 <w:rFonts w:ascii="Times New Roman" w:hAnsi="Times New Roman" w:cs="Times New Roman"/>
                 <w:lang w:val="en-US"/>
               </w:rPr>
-              <w:t>Classification Tree, Random Forest -Jin Qinhao (Sunday, 15 March 2026)</w:t>
+              <w:t xml:space="preserve">Classification Tree, Random Forest -Jin </w:t>
+            </w:r>
+            <w:proofErr w:type="spellStart"/>
+            <w:r>
+              <w:rPr>
+                <w:rFonts w:ascii="Times New Roman" w:hAnsi="Times New Roman" w:cs="Times New Roman"/>
+                <w:lang w:val="en-US"/>
+              </w:rPr>
+              <w:t>Qinhao</w:t>
+            </w:r>
+            <w:proofErr w:type="spellEnd"/>
+            <w:r>
+              <w:rPr>
+                <w:rFonts w:ascii="Times New Roman" w:hAnsi="Times New Roman" w:cs="Times New Roman"/>
+                <w:lang w:val="en-US"/>
+              </w:rPr>
+              <w:t xml:space="preserve"> (Sunday, 15 March 2026)</w:t>
             </w:r>
           </w:p>
           <w:p>
@@ -529,7 +619,23 @@
                 <w:rFonts w:ascii="Times New Roman" w:hAnsi="Times New Roman" w:cs="Times New Roman"/>
                 <w:lang w:val="en-US"/>
               </w:rPr>
-              <w:t>Cluster Analysis – Wang Zhuoran (Sunday, 15 March 2026)</w:t>
+              <w:t xml:space="preserve">Cluster Analysis – Wang </w:t>
+            </w:r>
+            <w:proofErr w:type="spellStart"/>
+            <w:r>
+              <w:rPr>
+                <w:rFonts w:ascii="Times New Roman" w:hAnsi="Times New Roman" w:cs="Times New Roman"/>
+                <w:lang w:val="en-US"/>
+              </w:rPr>
+              <w:t>Zhuoran</w:t>
+            </w:r>
+            <w:proofErr w:type="spellEnd"/>
+            <w:r>
+              <w:rPr>
+                <w:rFonts w:ascii="Times New Roman" w:hAnsi="Times New Roman" w:cs="Times New Roman"/>
+                <w:lang w:val="en-US"/>
+              </w:rPr>
+              <w:t xml:space="preserve"> (Sunday, 15 March 2026)</w:t>
             </w:r>
           </w:p>
         </w:tc>
@@ -603,7 +709,7 @@
     <w:p>
       <w:pPr>
         <w:rPr>
-          <w:rFonts w:ascii="Times New Roman" w:hAnsi="Times New Roman" w:cs="Times New Roman" w:hint="eastAsia"/>
+          <w:rFonts w:ascii="Times New Roman" w:hAnsi="Times New Roman" w:cs="Times New Roman"/>
           <w:lang w:val="en-US"/>
         </w:rPr>
       </w:pPr>

</xml_diff>